<commit_message>
Publish course materials (987c315)
Generated by scripts/publish_student.py from the source repository at 987c315: "Docker keeps only Ollama: retire the image definition and rewrite its README"
</commit_message>
<xml_diff>
--- a/syllabus/CSCI3495_Syllabus_Fall2026.docx
+++ b/syllabus/CSCI3495_Syllabus_Fall2026.docx
@@ -1168,7 +1168,7 @@
         <w:t>6 to 9 hours per week</w:t>
       </w:r>
       <w:r>
-        <w:t xml:space="preserve"> outside of class: the weekly reading or its video alternative, a homework assignment in most weeks, and steady project work after Week 5. The project is 35% of your grade and cannot be done in the last two weeks. Students who start each homework the day it is released consistently do better than students who start it the day before it is due, and the difference is not subtle.</w:t>
+        <w:t xml:space="preserve"> outside of class: the weekly reading or its video alternative, a homework assignment in most weeks, and steady project work after Week 6. The project is 35% of your grade and cannot be done in the last two weeks. Students who start each homework the day it is released consistently do better than students who start it the day before it is due, and the difference is not subtle.</w:t>
       </w:r>
     </w:p>
     <w:p>
@@ -1989,7 +1989,7 @@
         <w:t>Midterm</w:t>
       </w:r>
       <w:r>
-        <w:t xml:space="preserve"> (Week 11, Class 1, in class, about 70 minutes, 100 points): covers Weeks 1 through 10. Date: </w:t>
+        <w:t xml:space="preserve"> (Week 12, Class 1, in class, about 70 minutes, 100 points): covers Weeks 1 through 11. Date: </w:t>
       </w:r>
       <w:r>
         <w:rPr>
@@ -2601,7 +2601,7 @@
         <w:t>project work and instructor feedback time</w:t>
       </w:r>
       <w:r>
-        <w:t xml:space="preserve"> is built into Week 9 and Week 14, Class 2.</w:t>
+        <w:t xml:space="preserve"> is built into Week 10 and Week 14, Class 2.</w:t>
       </w:r>
     </w:p>
     <w:p>
@@ -3032,7 +3032,7 @@
               <w:rPr>
                 <w:sz w:val="22"/>
               </w:rPr>
-              <w:t>Project proposal due (Week 5)</w:t>
+              <w:t>Project proposal due (Week 6)</w:t>
             </w:r>
           </w:p>
         </w:tc>
@@ -3069,7 +3069,7 @@
               <w:rPr>
                 <w:sz w:val="22"/>
               </w:rPr>
-              <w:t>Project checkpoint due (Week 10)</w:t>
+              <w:t>Project checkpoint due (Week 11)</w:t>
             </w:r>
           </w:p>
         </w:tc>
@@ -3106,7 +3106,7 @@
               <w:rPr>
                 <w:sz w:val="22"/>
               </w:rPr>
-              <w:t>Midterm exam (Week 11, Class 1, in class)</w:t>
+              <w:t>Midterm exam (Week 12, Class 1, in class)</w:t>
             </w:r>
           </w:p>
         </w:tc>

</xml_diff>

<commit_message>
Publish course materials (be2b27ac)
Generated by scripts/publish_student.py from the source repository at be2b27ac: "Merge calendar-realign: weeks follow the calendar, Week 4 splits, HW6 gets real dates"
</commit_message>
<xml_diff>
--- a/syllabus/CSCI3495_Syllabus_Fall2026.docx
+++ b/syllabus/CSCI3495_Syllabus_Fall2026.docx
@@ -327,7 +327,7 @@
         <w:rPr>
           <w:b/>
         </w:rPr>
-        <w:t>Weeks 13 and 14 each run as a single combined session</w:t>
+        <w:t>Weeks 15 each run as a single combined session</w:t>
       </w:r>
       <w:r>
         <w:t>. Every week through Week 12 keeps both of its meetings. The dated schedule shows exactly which days these are.</w:t>
@@ -1989,13 +1989,13 @@
         <w:t>Midterm</w:t>
       </w:r>
       <w:r>
-        <w:t xml:space="preserve"> (Week 12, Class 1, in class, about 70 minutes, 100 points): covers Weeks 1 through 11. Date: </w:t>
-      </w:r>
-      <w:r>
-        <w:rPr>
-          <w:b/>
-        </w:rPr>
-        <w:t>Wednesday, November 4, 2026</w:t>
+        <w:t xml:space="preserve"> (Week 13, Class 1, in class, about 70 minutes, 100 points): covers Weeks 1 through 12. Date: </w:t>
+      </w:r>
+      <w:r>
+        <w:rPr>
+          <w:b/>
+        </w:rPr>
+        <w:t>Monday, November 16, 2026</w:t>
       </w:r>
     </w:p>
     <w:p>
@@ -2343,7 +2343,7 @@
               <w:rPr>
                 <w:sz w:val="22"/>
               </w:rPr>
-              <w:t>Mon Sep 28</w:t>
+              <w:t>Wed Oct 7</w:t>
             </w:r>
           </w:p>
         </w:tc>
@@ -2429,7 +2429,7 @@
               <w:rPr>
                 <w:sz w:val="22"/>
               </w:rPr>
-              <w:t>Wed Oct 28</w:t>
+              <w:t>Mon Nov 9</w:t>
             </w:r>
           </w:p>
         </w:tc>
@@ -3032,7 +3032,7 @@
               <w:rPr>
                 <w:sz w:val="22"/>
               </w:rPr>
-              <w:t>Project proposal due (Week 6)</w:t>
+              <w:t>Project proposal due (Week 7)</w:t>
             </w:r>
           </w:p>
         </w:tc>
@@ -3048,7 +3048,7 @@
               <w:rPr>
                 <w:sz w:val="22"/>
               </w:rPr>
-              <w:t>Monday, September 28, 2026</w:t>
+              <w:t>Wednesday, October 7, 2026</w:t>
             </w:r>
           </w:p>
         </w:tc>
@@ -3069,7 +3069,7 @@
               <w:rPr>
                 <w:sz w:val="22"/>
               </w:rPr>
-              <w:t>Project checkpoint due (Week 11)</w:t>
+              <w:t>Project checkpoint due (Week 12)</w:t>
             </w:r>
           </w:p>
         </w:tc>
@@ -3085,7 +3085,7 @@
               <w:rPr>
                 <w:sz w:val="22"/>
               </w:rPr>
-              <w:t>Wednesday, October 28, 2026</w:t>
+              <w:t>Monday, November 9, 2026</w:t>
             </w:r>
           </w:p>
         </w:tc>
@@ -3106,7 +3106,7 @@
               <w:rPr>
                 <w:sz w:val="22"/>
               </w:rPr>
-              <w:t>Midterm exam (Week 12, Class 1, in class)</w:t>
+              <w:t>Midterm exam (Week 13, Class 1, in class)</w:t>
             </w:r>
           </w:p>
         </w:tc>
@@ -3122,7 +3122,7 @@
               <w:rPr>
                 <w:sz w:val="22"/>
               </w:rPr>
-              <w:t>Wednesday, November 4, 2026</w:t>
+              <w:t>Monday, November 16, 2026</w:t>
             </w:r>
           </w:p>
         </w:tc>
@@ -4437,7 +4437,7 @@
               <w:rPr>
                 <w:sz w:val="20"/>
               </w:rPr>
-              <w:t>Contextual representations and transfer learning (ELMo). BERT and masked language modeling</w:t>
+              <w:t>BERT: contextual representations, the encoder stack, masked language modeling, fine-tuning</w:t>
             </w:r>
           </w:p>
         </w:tc>

</xml_diff>

<commit_message>
Publish course materials (27804a93)
Generated by scripts/publish_student.py from the source repository at 27804a93: "Readings: renumber for the two inserted weeks, and name the authority"
</commit_message>
<xml_diff>
--- a/syllabus/CSCI3495_Syllabus_Fall2026.docx
+++ b/syllabus/CSCI3495_Syllabus_Fall2026.docx
@@ -1322,7 +1322,7 @@
               <w:rPr>
                 <w:sz w:val="22"/>
               </w:rPr>
-              <w:t>Weekly quizzes (14, lowest dropped)</w:t>
+              <w:t>Quizzes (7, lowest dropped)</w:t>
             </w:r>
           </w:p>
         </w:tc>
@@ -1720,16 +1720,16 @@
         <w:t>paper quiz</w:t>
       </w:r>
       <w:r>
-        <w:t xml:space="preserve"> is given in the </w:t>
-      </w:r>
-      <w:r>
-        <w:rPr>
-          <w:b/>
-        </w:rPr>
-        <w:t>second class of every week</w:t>
-      </w:r>
-      <w:r>
-        <w:t xml:space="preserve"> (14 total), immediately before the break. Each is 10 points and takes about 10 minutes, with 5 to 8 questions mixing recall, reading comprehension, and short reasoning.</w:t>
+        <w:t xml:space="preserve"> is given seven times across the term (see the schedule for the dates), always in the second class of its week and immediately before the break. Each is 10 points and takes about 10 minutes, with 5 to 8 questions mixing recall, reading comprehension, and short reasoning. </w:t>
+      </w:r>
+      <w:r>
+        <w:rPr>
+          <w:b/>
+        </w:rPr>
+        <w:t>A quiz covers everything since the previous quiz</w:t>
+      </w:r>
+      <w:r>
+        <w:t>, so expect a two- to three-week span rather than a single week.</w:t>
       </w:r>
     </w:p>
     <w:p>
@@ -3333,7 +3333,7 @@
         <w:spacing w:after="120"/>
       </w:pPr>
       <w:r>
-        <w:t xml:space="preserve">Weekly quiz dates (the second class of each week) and homework release and due dates are on the course schedule. Per the Faculty Handbook, </w:t>
+        <w:t xml:space="preserve">Quiz dates and homework release and due dates are on the course schedule. Per the Faculty Handbook, </w:t>
       </w:r>
       <w:r>
         <w:rPr>

</xml_diff>